<commit_message>
Expand cloud operations bullets with full detailed descriptions
Co-authored-by: Copilot App <223556219+Copilot@users.noreply.github.com>
</commit_message>
<xml_diff>
--- a/Nimisha-Mehta-2Column-Professional.docx
+++ b/Nimisha-Mehta-2Column-Professional.docx
@@ -903,20 +903,6 @@
                 <w:color w:val="212121"/>
                 <w:sz w:val="18"/>
               </w:rPr>
-              <w:t>Drove IaC standardisation and reusable module libraries to reduce provisioning time by 40%</w:t>
-            </w:r>
-          </w:p>
-          <w:p>
-            <w:pPr>
-              <w:pStyle w:val="ListBullet"/>
-              <w:spacing w:after="40" w:line="269" w:lineRule="auto"/>
-              <w:ind w:left="288"/>
-            </w:pPr>
-            <w:r>
-              <w:rPr>
-                <w:color w:val="212121"/>
-                <w:sz w:val="18"/>
-              </w:rPr>
               <w:t>Built and maintained runbooks, SOPs, and DR playbooks for operational resilience</w:t>
             </w:r>
           </w:p>
@@ -932,7 +918,23 @@
                 <w:sz w:val="18"/>
                 <w:szCs w:val="18"/>
               </w:rPr>
-              <w:t>Led vRealize Automation (vRA) and vRealize Orchestrator (vRO) implementation to automate manual cloud provisioning and operational tasks, eliminating repetitive human effort and reducing turnaround time</w:t>
+              <w:t xml:space="preserve">Led vRealize Automation (vRA) and vRealize Orchestrator (vRO) implementation to automate manual cloud </w:t>
+            </w:r>
+            <w:r>
+              <w:rPr>
+                <w:color w:val="212121"/>
+                <w:sz w:val="18"/>
+                <w:szCs w:val="18"/>
+              </w:rPr>
+              <w:t xml:space="preserve">&amp; on-prem </w:t>
+            </w:r>
+            <w:r>
+              <w:rPr>
+                <w:color w:val="212121"/>
+                <w:sz w:val="18"/>
+                <w:szCs w:val="18"/>
+              </w:rPr>
+              <w:t>provisioning and operational tasks, eliminating repetitive human effort and reducing turnaround time</w:t>
             </w:r>
           </w:p>
           <w:p>
@@ -1007,7 +1009,7 @@
                 <w:szCs w:val="18"/>
                 <w:color w:val="212121"/>
               </w:rPr>
-              <w:t xml:space="preserve">Qualification of cloud services prior to onboarding: assessed architecture readiness, security posture, tagging standards, and compliance alignment</w:t>
+              <w:t xml:space="preserve">Conducted formal qualification of cloud services before onboarding — assessed architecture design, security posture, resource tagging standards, naming conventions, and compliance alignment to ensure workloads met enterprise cloud readiness criteria</w:t>
             </w:r>
           </w:p>
           <w:p>
@@ -1022,7 +1024,7 @@
                 <w:szCs w:val="18"/>
                 <w:color w:val="212121"/>
               </w:rPr>
-              <w:t xml:space="preserve">SLA tracking of ServiceNow tickets; delivered weekly and monthly highlight reports covering incident trends, ticket volumes, SLA breaches, and resolution metrics to stakeholders</w:t>
+              <w:t xml:space="preserve">Maintained rigorous SLA tracking for all ServiceNow incident and service request tickets; produced weekly and monthly highlight reports covering open/closed ticket volumes, SLA breach analysis, incident trends, MTTR metrics, and actionable recommendations shared with customer and management stakeholders</w:t>
             </w:r>
           </w:p>
           <w:p>
@@ -1037,7 +1039,7 @@
                 <w:szCs w:val="18"/>
                 <w:color w:val="212121"/>
               </w:rPr>
-              <w:t xml:space="preserve">Provided on-call support for P1/critical incidents; performed root cause analysis (RCA) and routed issues to correct resolver groups to ensure rapid recovery</w:t>
+              <w:t xml:space="preserve">Provided 24x7 on-call support for Priority 1 (P1) and critical incidents; led bridge calls, performed structured root cause analysis (RCA), coordinated with resolver teams, and ensured timely stakeholder communication and post-incident review documentation</w:t>
             </w:r>
           </w:p>
           <w:p>
@@ -1052,7 +1054,7 @@
                 <w:szCs w:val="18"/>
                 <w:color w:val="212121"/>
               </w:rPr>
-              <w:t xml:space="preserve">Cloud services managed: VNet, VMs, cloud provisioning workflows, landing zone setup and governance, private endpoints, and DNS zones</w:t>
+              <w:t xml:space="preserve">Administered key cloud services across Azure and AWS including Virtual Networks (VNet), Virtual Machines, automated cloud provisioning pipelines, landing zone governance, private endpoints, DNS zones, and storage account configurations</w:t>
             </w:r>
           </w:p>
           <w:p>
@@ -1067,7 +1069,7 @@
                 <w:szCs w:val="18"/>
                 <w:color w:val="212121"/>
               </w:rPr>
-              <w:t xml:space="preserve">Drove orphan resource cleanup initiatives across AWS and Azure — identified and decommissioned unused VMs, unattached disks, stale snapshots, and idle IPs to reduce cost and clutter</w:t>
+              <w:t xml:space="preserve">Led periodic orphan resource cleanup campaigns across Azure and AWS environments — identified and safely decommissioned unused virtual machines, unattached disks, stale snapshots, idle public IPs, and empty resource groups, delivering measurable cost savings and reducing environment clutter</w:t>
             </w:r>
           </w:p>
           <w:p>
@@ -1082,7 +1084,7 @@
                 <w:szCs w:val="18"/>
                 <w:color w:val="212121"/>
               </w:rPr>
-              <w:t xml:space="preserve">Managed Azure Policy enforcement, AWS SCPs, access management controls, and Entra ID (Azure AD) governance including role assignments, PIM, and conditional access</w:t>
+              <w:t xml:space="preserve">Enforced cloud governance through Azure Policy assignments, AWS Service Control Policies (SCPs), RBAC-based access management, and Entra ID (Azure AD) lifecycle management including role assignments, Privileged Identity Management (PIM), group policies, and conditional access configurations</w:t>
             </w:r>
           </w:p>
           <w:p>
@@ -1097,7 +1099,7 @@
                 <w:szCs w:val="18"/>
                 <w:color w:val="212121"/>
               </w:rPr>
-              <w:t xml:space="preserve">Oversaw cloud network operations: VNet peering, ExpressRoute/VPN connectivity, NSG rule reviews, firewall policy updates, and traffic routing configurations</w:t>
+              <w:t xml:space="preserve">Managed cloud network operations including VNet peering, Hub-Spoke topology governance, ExpressRoute and VPN connectivity validation, NSG rule review cycles, Palo Alto and Azure Firewall policy updates, and traffic routing configuration changes with full change management compliance</w:t>
             </w:r>
           </w:p>
           <w:p>
@@ -1112,7 +1114,7 @@
                 <w:szCs w:val="18"/>
                 <w:color w:val="212121"/>
               </w:rPr>
-              <w:t xml:space="preserve">Managed end-to-end cloud operations: from request intake and provisioning through monitoring, patching, incident resolution, and decommissioning</w:t>
+              <w:t xml:space="preserve">Delivered end-to-end cloud operations management — spanning service request intake, infrastructure provisioning, configuration, monitoring, patching, compliance checks, incident resolution, and structured decommissioning — ensuring full lifecycle accountability for all cloud assets</w:t>
             </w:r>
           </w:p>
           <w:p>
@@ -1127,7 +1129,7 @@
                 <w:szCs w:val="18"/>
                 <w:color w:val="212121"/>
               </w:rPr>
-              <w:t xml:space="preserve">Designed and maintained ServiceNow service catalogue items for cloud provisioning, access requests, and infrastructure change workflows — enabling self-service and reducing ops team toil</w:t>
+              <w:t xml:space="preserve">Designed, built, and maintained ServiceNow service catalogue items for cloud provisioning requests, access management workflows, and infrastructure change processes — enabling self-service for application teams and significantly reducing manual operations workload</w:t>
             </w:r>
           </w:p>
           <w:p>
@@ -1257,6 +1259,7 @@
                 <w:color w:val="1F4E79"/>
                 <w:sz w:val="20"/>
               </w:rPr>
+              <w:lastRenderedPageBreak/>
               <w:t>Azure Cloud Manager</w:t>
             </w:r>
           </w:p>

</xml_diff>

<commit_message>
Replace profile photo with nimisha_image.png (circular crop preserved)
Co-authored-by: Copilot App <223556219+Copilot@users.noreply.github.com>
</commit_message>
<xml_diff>
--- a/Nimisha-Mehta-2Column-Professional.docx
+++ b/Nimisha-Mehta-2Column-Professional.docx
@@ -540,14 +540,7 @@
                 <w:color w:val="595959"/>
                 <w:sz w:val="18"/>
               </w:rPr>
-              <w:t xml:space="preserve">·  </w:t>
-            </w:r>
-            <w:r>
-              <w:rPr>
-                <w:color w:val="595959"/>
-                <w:sz w:val="18"/>
-              </w:rPr>
-              <w:t>Operational</w:t>
+              <w:t>·  Operational</w:t>
             </w:r>
             <w:proofErr w:type="gramEnd"/>
             <w:r>
@@ -790,15 +783,7 @@
                 <w:color w:val="4682B4"/>
                 <w:sz w:val="18"/>
               </w:rPr>
-              <w:t xml:space="preserve">) </w:t>
-            </w:r>
-            <w:r>
-              <w:rPr>
-                <w:b/>
-                <w:color w:val="4682B4"/>
-                <w:sz w:val="18"/>
-              </w:rPr>
-              <w:t>Lead</w:t>
+              <w:t>) Lead</w:t>
             </w:r>
           </w:p>
           <w:p>
@@ -807,6 +792,7 @@
               <w:spacing w:after="40" w:line="269" w:lineRule="auto"/>
               <w:ind w:left="288"/>
             </w:pPr>
+            <w:bookmarkStart w:id="0" w:name="OLE_LINK1"/>
             <w:r>
               <w:rPr>
                 <w:color w:val="212121"/>
@@ -847,21 +833,7 @@
                 <w:color w:val="212121"/>
                 <w:sz w:val="18"/>
               </w:rPr>
-              <w:t xml:space="preserve">Utilizing </w:t>
-            </w:r>
-            <w:r>
-              <w:rPr>
-                <w:color w:val="212121"/>
-                <w:sz w:val="18"/>
-              </w:rPr>
-              <w:t>Terraform</w:t>
-            </w:r>
-            <w:r>
-              <w:rPr>
-                <w:color w:val="212121"/>
-                <w:sz w:val="18"/>
-              </w:rPr>
-              <w:t xml:space="preserve"> based pipeline for operational efficiency. </w:t>
+              <w:t xml:space="preserve">Utilizing Terraform based pipeline for operational efficiency. </w:t>
             </w:r>
           </w:p>
           <w:p>
@@ -964,7 +936,7 @@
                 <w:sz w:val="18"/>
                 <w:szCs w:val="18"/>
               </w:rPr>
-              <w:t>Drove SLA adherence for automated service requests end-to-end, reducing manual effort by over 60% and improving fulfilment speed from days to hours</w:t>
+              <w:t>Maintained rigorous SLA tracking for all ServiceNow incident and service request tickets; produced weekly and monthly highlight reports covering open/closed ticket volumes, SLA breach analysis, incident trends, MTTR metrics, and actionable recommendations shared with customer and management stakeholders</w:t>
             </w:r>
           </w:p>
           <w:p>
@@ -1005,11 +977,11 @@
             </w:pPr>
             <w:r>
               <w:rPr>
+                <w:color w:val="212121"/>
                 <w:sz w:val="18"/>
                 <w:szCs w:val="18"/>
-                <w:color w:val="212121"/>
               </w:rPr>
-              <w:t xml:space="preserve">Conducted formal qualification of cloud services before onboarding — assessed architecture design, security posture, resource tagging standards, naming conventions, and compliance alignment to ensure workloads met enterprise cloud readiness criteria</w:t>
+              <w:t>Conducted formal qualification of cloud services before onboarding — assessed architecture design, security posture, resource tagging standards, naming conventions, and compliance alignment to ensure workloads met enterprise cloud readiness criteria</w:t>
             </w:r>
           </w:p>
           <w:p>
@@ -1020,11 +992,11 @@
             </w:pPr>
             <w:r>
               <w:rPr>
+                <w:color w:val="212121"/>
                 <w:sz w:val="18"/>
                 <w:szCs w:val="18"/>
-                <w:color w:val="212121"/>
               </w:rPr>
-              <w:t xml:space="preserve">Maintained rigorous SLA tracking for all ServiceNow incident and service request tickets; produced weekly and monthly highlight reports covering open/closed ticket volumes, SLA breach analysis, incident trends, MTTR metrics, and actionable recommendations shared with customer and management stakeholders</w:t>
+              <w:t>Provided 24x7 on-call support for Priority 1 (P1) and critical incidents; led bridge calls, performed structured root cause analysis (RCA), coordinated with resolver teams, and ensured timely stakeholder communication and post-incident review documentation</w:t>
             </w:r>
           </w:p>
           <w:p>
@@ -1035,11 +1007,11 @@
             </w:pPr>
             <w:r>
               <w:rPr>
+                <w:color w:val="212121"/>
                 <w:sz w:val="18"/>
                 <w:szCs w:val="18"/>
-                <w:color w:val="212121"/>
               </w:rPr>
-              <w:t xml:space="preserve">Provided 24x7 on-call support for Priority 1 (P1) and critical incidents; led bridge calls, performed structured root cause analysis (RCA), coordinated with resolver teams, and ensured timely stakeholder communication and post-incident review documentation</w:t>
+              <w:t>Administered key cloud services across Azure and AWS including Virtual Networks (VNet), Virtual Machines, automated cloud provisioning pipelines, landing zone governance, private endpoints, DNS zones, and storage account configurations</w:t>
             </w:r>
           </w:p>
           <w:p>
@@ -1050,11 +1022,11 @@
             </w:pPr>
             <w:r>
               <w:rPr>
+                <w:color w:val="212121"/>
                 <w:sz w:val="18"/>
                 <w:szCs w:val="18"/>
-                <w:color w:val="212121"/>
               </w:rPr>
-              <w:t xml:space="preserve">Administered key cloud services across Azure and AWS including Virtual Networks (VNet), Virtual Machines, automated cloud provisioning pipelines, landing zone governance, private endpoints, DNS zones, and storage account configurations</w:t>
+              <w:t>Led periodic orphan resource cleanup campaigns across Azure and AWS environments — identified and safely decommissioned unused virtual machines, unattached disks, stale snapshots, idle public IPs, and empty resource groups, delivering measurable cost savings and reducing environment clutter</w:t>
             </w:r>
           </w:p>
           <w:p>
@@ -1065,11 +1037,11 @@
             </w:pPr>
             <w:r>
               <w:rPr>
+                <w:color w:val="212121"/>
                 <w:sz w:val="18"/>
                 <w:szCs w:val="18"/>
-                <w:color w:val="212121"/>
               </w:rPr>
-              <w:t xml:space="preserve">Led periodic orphan resource cleanup campaigns across Azure and AWS environments — identified and safely decommissioned unused virtual machines, unattached disks, stale snapshots, idle public IPs, and empty resource groups, delivering measurable cost savings and reducing environment clutter</w:t>
+              <w:t>Enforced cloud governance through Azure Policy assignments, AWS Service Control Policies (SCPs), RBAC-based access management, and Entra ID (Azure AD) lifecycle management including role assignments, Privileged Identity Management (PIM), group policies, and conditional access configurations</w:t>
             </w:r>
           </w:p>
           <w:p>
@@ -1080,11 +1052,20 @@
             </w:pPr>
             <w:r>
               <w:rPr>
+                <w:color w:val="212121"/>
                 <w:sz w:val="18"/>
                 <w:szCs w:val="18"/>
+              </w:rPr>
+              <w:t xml:space="preserve">Managed cloud network operations including VNet peering, Hub-Spoke topology </w:t>
+            </w:r>
+            <w:r>
+              <w:rPr>
                 <w:color w:val="212121"/>
+                <w:sz w:val="18"/>
+                <w:szCs w:val="18"/>
               </w:rPr>
-              <w:t xml:space="preserve">Enforced cloud governance through Azure Policy assignments, AWS Service Control Policies (SCPs), RBAC-based access management, and Entra ID (Azure AD) lifecycle management including role assignments, Privileged Identity Management (PIM), group policies, and conditional access configurations</w:t>
+              <w:lastRenderedPageBreak/>
+              <w:t>governance, ExpressRoute and VPN connectivity validation, NSG rule review cycles, Palo Alto and Azure Firewall policy updates, and traffic routing configuration changes with full change management compliance</w:t>
             </w:r>
           </w:p>
           <w:p>
@@ -1095,11 +1076,11 @@
             </w:pPr>
             <w:r>
               <w:rPr>
+                <w:color w:val="212121"/>
                 <w:sz w:val="18"/>
                 <w:szCs w:val="18"/>
-                <w:color w:val="212121"/>
               </w:rPr>
-              <w:t xml:space="preserve">Managed cloud network operations including VNet peering, Hub-Spoke topology governance, ExpressRoute and VPN connectivity validation, NSG rule review cycles, Palo Alto and Azure Firewall policy updates, and traffic routing configuration changes with full change management compliance</w:t>
+              <w:t>Delivered end-to-end cloud operations management — spanning service request intake, infrastructure provisioning, configuration, monitoring, patching, compliance checks, incident resolution, and structured decommissioning — ensuring full lifecycle accountability for all cloud assets</w:t>
             </w:r>
           </w:p>
           <w:p>
@@ -1110,28 +1091,14 @@
             </w:pPr>
             <w:r>
               <w:rPr>
+                <w:color w:val="212121"/>
                 <w:sz w:val="18"/>
                 <w:szCs w:val="18"/>
-                <w:color w:val="212121"/>
               </w:rPr>
-              <w:t xml:space="preserve">Delivered end-to-end cloud operations management — spanning service request intake, infrastructure provisioning, configuration, monitoring, patching, compliance checks, incident resolution, and structured decommissioning — ensuring full lifecycle accountability for all cloud assets</w:t>
+              <w:t>Designed, built, and maintained ServiceNow service catalogue items for cloud provisioning requests, access management workflows, and infrastructure change processes — enabling self-service for application teams and significantly reducing manual operations workload</w:t>
             </w:r>
           </w:p>
-          <w:p>
-            <w:pPr>
-              <w:pStyle w:val="ListBullet"/>
-              <w:spacing w:after="40"/>
-              <w:ind w:left="288" w:hanging="288"/>
-            </w:pPr>
-            <w:r>
-              <w:rPr>
-                <w:sz w:val="18"/>
-                <w:szCs w:val="18"/>
-                <w:color w:val="212121"/>
-              </w:rPr>
-              <w:t xml:space="preserve">Designed, built, and maintained ServiceNow service catalogue items for cloud provisioning requests, access management workflows, and infrastructure change processes — enabling self-service for application teams and significantly reducing manual operations workload</w:t>
-            </w:r>
-          </w:p>
+          <w:bookmarkEnd w:id="0"/>
           <w:p>
             <w:pPr>
               <w:spacing w:before="100" w:after="60"/>
@@ -1259,7 +1226,6 @@
                 <w:color w:val="1F4E79"/>
                 <w:sz w:val="20"/>
               </w:rPr>
-              <w:lastRenderedPageBreak/>
               <w:t>Azure Cloud Manager</w:t>
             </w:r>
           </w:p>
@@ -1478,7 +1444,15 @@
                 <w:color w:val="212121"/>
                 <w:sz w:val="18"/>
               </w:rPr>
-              <w:t>Strengthened delivery governance across operations and engineering, improving team output and audit scores</w:t>
+              <w:t xml:space="preserve">Strengthened delivery governance across operations and engineering, improving team </w:t>
+            </w:r>
+            <w:r>
+              <w:rPr>
+                <w:color w:val="212121"/>
+                <w:sz w:val="18"/>
+              </w:rPr>
+              <w:lastRenderedPageBreak/>
+              <w:t>output and audit scores</w:t>
             </w:r>
           </w:p>
           <w:p>
@@ -1672,7 +1646,7 @@
   <w:abstractNum w:abstractNumId="8" w15:restartNumberingAfterBreak="0">
     <w:nsid w:val="FFFFFF89"/>
     <w:multiLevelType w:val="singleLevel"/>
-    <w:tmpl w:val="29761A62"/>
+    <w:tmpl w:val="405C6D1A"/>
     <w:lvl w:ilvl="0">
       <w:start w:val="1"/>
       <w:numFmt w:val="bullet"/>

</xml_diff>

<commit_message>
Replace Public Cloud role responsibilities in resume
Co-authored-by: Copilot App <223556219+Copilot@users.noreply.github.com>
</commit_message>
<xml_diff>
--- a/Nimisha-Mehta-2Column-Professional.docx
+++ b/Nimisha-Mehta-2Column-Professional.docx
@@ -792,20 +792,8 @@
               <w:spacing w:after="40" w:line="269" w:lineRule="auto"/>
               <w:ind w:left="288"/>
             </w:pPr>
-            <w:bookmarkStart w:id="0" w:name="OLE_LINK1"/>
             <w:r>
-              <w:rPr>
-                <w:color w:val="212121"/>
-                <w:sz w:val="18"/>
-              </w:rPr>
-              <w:t>Led end-to-end public cloud operations across AWS and Azure for enterprise clients in Pharma</w:t>
-            </w:r>
-            <w:r>
-              <w:rPr>
-                <w:color w:val="212121"/>
-                <w:sz w:val="18"/>
-              </w:rPr>
-              <w:t xml:space="preserve"> domain</w:t>
+              <w:t>Led end-to-end public cloud operations across AWS and Azure for enterprise clients in Pharma domain</w:t>
             </w:r>
           </w:p>
           <w:p>
@@ -815,10 +803,6 @@
               <w:ind w:left="288"/>
             </w:pPr>
             <w:r>
-              <w:rPr>
-                <w:color w:val="212121"/>
-                <w:sz w:val="18"/>
-              </w:rPr>
               <w:t>Owned operational governance: SLA/KPI tracking, service reviews, risk management, and escalation handling</w:t>
             </w:r>
           </w:p>
@@ -829,11 +813,7 @@
               <w:ind w:left="288"/>
             </w:pPr>
             <w:r>
-              <w:rPr>
-                <w:color w:val="212121"/>
-                <w:sz w:val="18"/>
-              </w:rPr>
-              <w:t xml:space="preserve">Utilizing Terraform based pipeline for operational efficiency. </w:t>
+              <w:t>Utilizing Terraform based pipeline in Azure DevOps for operational efficiency.</w:t>
             </w:r>
           </w:p>
           <w:p>
@@ -843,11 +823,7 @@
               <w:ind w:left="288"/>
             </w:pPr>
             <w:r>
-              <w:rPr>
-                <w:color w:val="212121"/>
-                <w:sz w:val="18"/>
-              </w:rPr>
-              <w:t>Established Splunk-based observability using Event Hub and CloudTrail for real-time alerting and incident detection</w:t>
+              <w:t>Established Splunk-based observability using Azure Event Hub and AWS CloudTrail for real-time alerting and incident detection</w:t>
             </w:r>
           </w:p>
           <w:p>
@@ -857,10 +833,6 @@
               <w:ind w:left="288"/>
             </w:pPr>
             <w:r>
-              <w:rPr>
-                <w:color w:val="212121"/>
-                <w:sz w:val="18"/>
-              </w:rPr>
               <w:t>Implemented AWS Instance Scheduler and Azure auto-shutdown policies for FinOps and cost reduction</w:t>
             </w:r>
           </w:p>
@@ -871,11 +843,7 @@
               <w:ind w:left="288"/>
             </w:pPr>
             <w:r>
-              <w:rPr>
-                <w:color w:val="212121"/>
-                <w:sz w:val="18"/>
-              </w:rPr>
-              <w:t>Built and maintained runbooks, SOPs, and DR playbooks for operational resilience</w:t>
+              <w:t>Built and maintained runbooks, SOPs, Design Specification documents and Work Instructions for operational resilience</w:t>
             </w:r>
           </w:p>
           <w:p>
@@ -885,28 +853,7 @@
               <w:ind w:left="288" w:hanging="288"/>
             </w:pPr>
             <w:r>
-              <w:rPr>
-                <w:color w:val="212121"/>
-                <w:sz w:val="18"/>
-                <w:szCs w:val="18"/>
-              </w:rPr>
-              <w:t xml:space="preserve">Led vRealize Automation (vRA) and vRealize Orchestrator (vRO) implementation to automate manual cloud </w:t>
-            </w:r>
-            <w:r>
-              <w:rPr>
-                <w:color w:val="212121"/>
-                <w:sz w:val="18"/>
-                <w:szCs w:val="18"/>
-              </w:rPr>
-              <w:t xml:space="preserve">&amp; on-prem </w:t>
-            </w:r>
-            <w:r>
-              <w:rPr>
-                <w:color w:val="212121"/>
-                <w:sz w:val="18"/>
-                <w:szCs w:val="18"/>
-              </w:rPr>
-              <w:t>provisioning and operational tasks, eliminating repetitive human effort and reducing turnaround time</w:t>
+              <w:t>Led vRealize Automation (vRA) and vRealize Orchestrator (vRO) implementation to automate manual cloud &amp; on-prem provisioning and operational tasks, eliminating repetitive human effort and reducing turnaround time</w:t>
             </w:r>
           </w:p>
           <w:p>
@@ -916,12 +863,7 @@
               <w:ind w:left="288" w:hanging="288"/>
             </w:pPr>
             <w:r>
-              <w:rPr>
-                <w:color w:val="212121"/>
-                <w:sz w:val="18"/>
-                <w:szCs w:val="18"/>
-              </w:rPr>
-              <w:t>Managed and maintained a library of 40+ vRO workflows covering VM lifecycle, DNS updates, storage provisioning, snapshot management, and compliance reporting</w:t>
+              <w:t>Managed and maintained a library of 20+ vRO workflows covering VM lifecycle, DNS updates, storage provisioning, snapshot management, and IP Management.</w:t>
             </w:r>
           </w:p>
           <w:p>
@@ -931,11 +873,36 @@
               <w:ind w:left="288" w:hanging="288"/>
             </w:pPr>
             <w:r>
-              <w:rPr>
-                <w:color w:val="212121"/>
-                <w:sz w:val="18"/>
-                <w:szCs w:val="18"/>
-              </w:rPr>
+              <w:t>Led operations team in adopting vRA self-service portal(Aria), and letting them leveraged by other teams as well.</w:t>
+            </w:r>
+          </w:p>
+          <w:p>
+            <w:pPr>
+              <w:pStyle w:val="ListBullet"/>
+              <w:spacing w:after="40"/>
+              <w:ind w:left="288" w:hanging="288"/>
+            </w:pPr>
+            <w:r>
+              <w:t>Coordinated workflow governance: versioning, testing, peer review, and approval processes for all vRO workflow changes in production</w:t>
+            </w:r>
+          </w:p>
+          <w:p>
+            <w:pPr>
+              <w:pStyle w:val="ListBullet"/>
+              <w:spacing w:after="40"/>
+              <w:ind w:left="288" w:hanging="288"/>
+            </w:pPr>
+            <w:r>
+              <w:t>Conducted formal qualification of cloud services before onboarding - assessed architecture design, security posture, resource tagging standards, naming conventions, and compliance alignment to ensure workloads met enterprise cloud readiness criteria</w:t>
+            </w:r>
+          </w:p>
+          <w:p>
+            <w:pPr>
+              <w:pStyle w:val="ListBullet"/>
+              <w:spacing w:after="40"/>
+              <w:ind w:left="288" w:hanging="288"/>
+            </w:pPr>
+            <w:r>
               <w:t>Maintained rigorous SLA tracking for all ServiceNow incident and service request tickets; produced weekly and monthly highlight reports covering open/closed ticket volumes, SLA breach analysis, incident trends, MTTR metrics, and actionable recommendations shared with customer and management stakeholders</w:t>
             </w:r>
           </w:p>
@@ -946,56 +913,6 @@
               <w:ind w:left="288" w:hanging="288"/>
             </w:pPr>
             <w:r>
-              <w:rPr>
-                <w:color w:val="212121"/>
-                <w:sz w:val="18"/>
-                <w:szCs w:val="18"/>
-              </w:rPr>
-              <w:t>Led operations team in adopting vRA self-service portal, enabling application teams to provision approved cloud resources without manual intervention</w:t>
-            </w:r>
-          </w:p>
-          <w:p>
-            <w:pPr>
-              <w:pStyle w:val="ListBullet"/>
-              <w:spacing w:after="40"/>
-              <w:ind w:left="288" w:hanging="288"/>
-            </w:pPr>
-            <w:r>
-              <w:rPr>
-                <w:color w:val="212121"/>
-                <w:sz w:val="18"/>
-                <w:szCs w:val="18"/>
-              </w:rPr>
-              <w:t>Coordinated workflow governance: versioning, testing, peer review, and approval processes for all vRO workflow changes in production</w:t>
-            </w:r>
-          </w:p>
-          <w:p>
-            <w:pPr>
-              <w:pStyle w:val="ListBullet"/>
-              <w:spacing w:after="40"/>
-              <w:ind w:left="288" w:hanging="288"/>
-            </w:pPr>
-            <w:r>
-              <w:rPr>
-                <w:color w:val="212121"/>
-                <w:sz w:val="18"/>
-                <w:szCs w:val="18"/>
-              </w:rPr>
-              <w:t>Conducted formal qualification of cloud services before onboarding — assessed architecture design, security posture, resource tagging standards, naming conventions, and compliance alignment to ensure workloads met enterprise cloud readiness criteria</w:t>
-            </w:r>
-          </w:p>
-          <w:p>
-            <w:pPr>
-              <w:pStyle w:val="ListBullet"/>
-              <w:spacing w:after="40"/>
-              <w:ind w:left="288" w:hanging="288"/>
-            </w:pPr>
-            <w:r>
-              <w:rPr>
-                <w:color w:val="212121"/>
-                <w:sz w:val="18"/>
-                <w:szCs w:val="18"/>
-              </w:rPr>
               <w:t>Provided 24x7 on-call support for Priority 1 (P1) and critical incidents; led bridge calls, performed structured root cause analysis (RCA), coordinated with resolver teams, and ensured timely stakeholder communication and post-incident review documentation</w:t>
             </w:r>
           </w:p>
@@ -1006,12 +923,7 @@
               <w:ind w:left="288" w:hanging="288"/>
             </w:pPr>
             <w:r>
-              <w:rPr>
-                <w:color w:val="212121"/>
-                <w:sz w:val="18"/>
-                <w:szCs w:val="18"/>
-              </w:rPr>
-              <w:t>Administered key cloud services across Azure and AWS including Virtual Networks (VNet), Virtual Machines, automated cloud provisioning pipelines, landing zone governance, private endpoints, DNS zones, and storage account configurations</w:t>
+              <w:t>Administered key cloud services across Azure and AWS including Virtual Networks (VNet), Virtual Machines, automated cloud provisioning pipelines, landing zone governance, private endpoints, DNS zones, App Services and storage account configurations</w:t>
             </w:r>
           </w:p>
           <w:p>
@@ -1021,12 +933,7 @@
               <w:ind w:left="288" w:hanging="288"/>
             </w:pPr>
             <w:r>
-              <w:rPr>
-                <w:color w:val="212121"/>
-                <w:sz w:val="18"/>
-                <w:szCs w:val="18"/>
-              </w:rPr>
-              <w:t>Led periodic orphan resource cleanup campaigns across Azure and AWS environments — identified and safely decommissioned unused virtual machines, unattached disks, stale snapshots, idle public IPs, and empty resource groups, delivering measurable cost savings and reducing environment clutter</w:t>
+              <w:t>Led periodic orphan resource cleanup across Azure and AWS environments - identified and safely decommissioned unused virtual machines, unattached disks, stale snapshots, idle public IPs, and empty resource groups, delivering measurable cost savings and reducing environment clutter</w:t>
             </w:r>
           </w:p>
           <w:p>
@@ -1036,11 +943,6 @@
               <w:ind w:left="288" w:hanging="288"/>
             </w:pPr>
             <w:r>
-              <w:rPr>
-                <w:color w:val="212121"/>
-                <w:sz w:val="18"/>
-                <w:szCs w:val="18"/>
-              </w:rPr>
               <w:t>Enforced cloud governance through Azure Policy assignments, AWS Service Control Policies (SCPs), RBAC-based access management, and Entra ID (Azure AD) lifecycle management including role assignments, Privileged Identity Management (PIM), group policies, and conditional access configurations</w:t>
             </w:r>
           </w:p>
@@ -1051,21 +953,7 @@
               <w:ind w:left="288" w:hanging="288"/>
             </w:pPr>
             <w:r>
-              <w:rPr>
-                <w:color w:val="212121"/>
-                <w:sz w:val="18"/>
-                <w:szCs w:val="18"/>
-              </w:rPr>
-              <w:t xml:space="preserve">Managed cloud network operations including VNet peering, Hub-Spoke topology </w:t>
-            </w:r>
-            <w:r>
-              <w:rPr>
-                <w:color w:val="212121"/>
-                <w:sz w:val="18"/>
-                <w:szCs w:val="18"/>
-              </w:rPr>
-              <w:lastRenderedPageBreak/>
-              <w:t>governance, ExpressRoute and VPN connectivity validation, NSG rule review cycles, Palo Alto and Azure Firewall policy updates, and traffic routing configuration changes with full change management compliance</w:t>
+              <w:t>Managed cloud network operations including VNet peering, Hub-Spoke topology governance, ExpressRoute and VPN connectivity validation, NSG rule review cycles, and traffic routing configuration changes with full change management compliance</w:t>
             </w:r>
           </w:p>
           <w:p>
@@ -1075,12 +963,7 @@
               <w:ind w:left="288" w:hanging="288"/>
             </w:pPr>
             <w:r>
-              <w:rPr>
-                <w:color w:val="212121"/>
-                <w:sz w:val="18"/>
-                <w:szCs w:val="18"/>
-              </w:rPr>
-              <w:t>Delivered end-to-end cloud operations management — spanning service request intake, infrastructure provisioning, configuration, monitoring, patching, compliance checks, incident resolution, and structured decommissioning — ensuring full lifecycle accountability for all cloud assets</w:t>
+              <w:t>Delivered end-to-end cloud operations management - spanning service request intake, infrastructure provisioning, configuration, monitoring, patching, compliance checks, incident resolution, Problem Management ensuring full lifecycle accountability for all cloud assets</w:t>
             </w:r>
           </w:p>
           <w:p>
@@ -1090,12 +973,7 @@
               <w:ind w:left="288" w:hanging="288"/>
             </w:pPr>
             <w:r>
-              <w:rPr>
-                <w:color w:val="212121"/>
-                <w:sz w:val="18"/>
-                <w:szCs w:val="18"/>
-              </w:rPr>
-              <w:t>Designed, built, and maintained ServiceNow service catalogue items for cloud provisioning requests, access management workflows, and infrastructure change processes — enabling self-service for application teams and significantly reducing manual operations workload</w:t>
+              <w:t>Designed, built, and maintained ServiceNow service catalogue items for cloud provisioning requests and enabling ServiceNow Discovery for better governance and compliance.</w:t>
             </w:r>
           </w:p>
           <w:bookmarkEnd w:id="0"/>

</xml_diff>

<commit_message>
Sync ATS and site content with final resume
Co-authored-by: Copilot App <223556219+Copilot@users.noreply.github.com>
</commit_message>
<xml_diff>
--- a/Nimisha-Mehta-2Column-Professional.docx
+++ b/Nimisha-Mehta-2Column-Professional.docx
@@ -390,12 +390,96 @@
               <w:spacing w:after="80"/>
               <w:ind w:left="115"/>
             </w:pPr>
+            <w:proofErr w:type="gramStart"/>
             <w:r>
               <w:rPr>
                 <w:color w:val="D2E4F5"/>
                 <w:sz w:val="16"/>
               </w:rPr>
-              <w:t>✔  AZ-900  Azure Fundamentals</w:t>
+              <w:t>✔  A</w:t>
+            </w:r>
+            <w:r>
+              <w:rPr>
+                <w:color w:val="D2E4F5"/>
+                <w:sz w:val="16"/>
+              </w:rPr>
+              <w:t>I</w:t>
+            </w:r>
+            <w:proofErr w:type="gramEnd"/>
+            <w:r>
+              <w:rPr>
+                <w:color w:val="D2E4F5"/>
+                <w:sz w:val="16"/>
+              </w:rPr>
+              <w:t>-</w:t>
+            </w:r>
+            <w:proofErr w:type="gramStart"/>
+            <w:r>
+              <w:rPr>
+                <w:color w:val="D2E4F5"/>
+                <w:sz w:val="16"/>
+              </w:rPr>
+              <w:t>900  Azure</w:t>
+            </w:r>
+            <w:proofErr w:type="gramEnd"/>
+            <w:r>
+              <w:rPr>
+                <w:color w:val="D2E4F5"/>
+                <w:sz w:val="16"/>
+              </w:rPr>
+              <w:t xml:space="preserve"> </w:t>
+            </w:r>
+            <w:r>
+              <w:rPr>
+                <w:color w:val="D2E4F5"/>
+                <w:sz w:val="16"/>
+              </w:rPr>
+              <w:t xml:space="preserve">AI </w:t>
+            </w:r>
+            <w:r>
+              <w:rPr>
+                <w:color w:val="D2E4F5"/>
+                <w:sz w:val="16"/>
+              </w:rPr>
+              <w:t>Fundamentals</w:t>
+            </w:r>
+          </w:p>
+          <w:p>
+            <w:pPr>
+              <w:spacing w:after="80"/>
+              <w:ind w:left="115"/>
+            </w:pPr>
+            <w:proofErr w:type="gramStart"/>
+            <w:r>
+              <w:rPr>
+                <w:color w:val="D2E4F5"/>
+                <w:sz w:val="16"/>
+              </w:rPr>
+              <w:t>✔  AZ</w:t>
+            </w:r>
+            <w:proofErr w:type="gramEnd"/>
+            <w:r>
+              <w:rPr>
+                <w:color w:val="D2E4F5"/>
+                <w:sz w:val="16"/>
+              </w:rPr>
+              <w:t>-</w:t>
+            </w:r>
+            <w:proofErr w:type="gramStart"/>
+            <w:r>
+              <w:rPr>
+                <w:color w:val="D2E4F5"/>
+                <w:sz w:val="16"/>
+              </w:rPr>
+              <w:t>900  Azure</w:t>
+            </w:r>
+            <w:proofErr w:type="gramEnd"/>
+            <w:r>
+              <w:rPr>
+                <w:color w:val="D2E4F5"/>
+                <w:sz w:val="16"/>
+              </w:rPr>
+              <w:t xml:space="preserve"> Fundamentals</w:t>
             </w:r>
           </w:p>
           <w:p>
@@ -681,16 +765,23 @@
               <w:spacing w:before="100" w:after="60"/>
               <w:ind w:left="144"/>
             </w:pPr>
-            <w:proofErr w:type="gramStart"/>
+            <w:r>
+              <w:rPr>
+                <w:rFonts w:ascii="Segoe UI Symbol" w:hAnsi="Segoe UI Symbol" w:cs="Segoe UI Symbol"/>
+                <w:b/>
+                <w:color w:val="4682B4"/>
+                <w:sz w:val="18"/>
+              </w:rPr>
+              <w:t>▸</w:t>
+            </w:r>
             <w:r>
               <w:rPr>
                 <w:b/>
                 <w:color w:val="4682B4"/>
                 <w:sz w:val="18"/>
               </w:rPr>
-              <w:t>▸  Public</w:t>
+              <w:t xml:space="preserve"> Public</w:t>
             </w:r>
-            <w:proofErr w:type="gramEnd"/>
             <w:r>
               <w:rPr>
                 <w:b/>
@@ -699,24 +790,14 @@
               </w:rPr>
               <w:t xml:space="preserve"> </w:t>
             </w:r>
-            <w:proofErr w:type="gramStart"/>
             <w:r>
               <w:rPr>
                 <w:b/>
                 <w:color w:val="4682B4"/>
                 <w:sz w:val="18"/>
               </w:rPr>
-              <w:t>Cloud</w:t>
+              <w:t>Cloud (</w:t>
             </w:r>
-            <w:r>
-              <w:rPr>
-                <w:b/>
-                <w:color w:val="4682B4"/>
-                <w:sz w:val="18"/>
-              </w:rPr>
-              <w:t>(</w:t>
-            </w:r>
-            <w:proofErr w:type="gramEnd"/>
             <w:r>
               <w:rPr>
                 <w:b/>
@@ -923,6 +1004,7 @@
               <w:ind w:left="288" w:hanging="288"/>
             </w:pPr>
             <w:r>
+              <w:lastRenderedPageBreak/>
               <w:t>Administered key cloud services across Azure and AWS including Virtual Networks (VNet), Virtual Machines, automated cloud provisioning pipelines, landing zone governance, private endpoints, DNS zones, App Services and storage account configurations</w:t>
             </w:r>
           </w:p>
@@ -976,19 +1058,28 @@
               <w:t>Designed, built, and maintained ServiceNow service catalogue items for cloud provisioning requests and enabling ServiceNow Discovery for better governance and compliance.</w:t>
             </w:r>
           </w:p>
-          <w:bookmarkEnd w:id="0"/>
           <w:p>
             <w:pPr>
               <w:spacing w:before="100" w:after="60"/>
               <w:ind w:left="144"/>
             </w:pPr>
+            <w:proofErr w:type="gramStart"/>
             <w:r>
               <w:rPr>
                 <w:b/>
                 <w:color w:val="4682B4"/>
                 <w:sz w:val="18"/>
               </w:rPr>
-              <w:t>▸  Azure Cloud Lead — Novartis / Sandoz (Pharma)</w:t>
+              <w:t>▸  Azure</w:t>
+            </w:r>
+            <w:proofErr w:type="gramEnd"/>
+            <w:r>
+              <w:rPr>
+                <w:b/>
+                <w:color w:val="4682B4"/>
+                <w:sz w:val="18"/>
+              </w:rPr>
+              <w:t xml:space="preserve"> Cloud Lead — Novartis / Sandoz (Pharma)</w:t>
             </w:r>
           </w:p>
           <w:p>
@@ -998,10 +1089,6 @@
               <w:ind w:left="288"/>
             </w:pPr>
             <w:r>
-              <w:rPr>
-                <w:color w:val="212121"/>
-                <w:sz w:val="18"/>
-              </w:rPr>
               <w:t>Served as Azure technical lead for migration and steady-state operations of Novartis and Sandoz cloud environments</w:t>
             </w:r>
           </w:p>
@@ -1012,10 +1099,6 @@
               <w:ind w:left="288"/>
             </w:pPr>
             <w:r>
-              <w:rPr>
-                <w:color w:val="212121"/>
-                <w:sz w:val="18"/>
-              </w:rPr>
               <w:t>Managed Azure infrastructure lifecycle: App Services, AKS, Key Vault, VNets, Storage, and Entra ID configurations</w:t>
             </w:r>
           </w:p>
@@ -1026,10 +1109,6 @@
               <w:ind w:left="288"/>
             </w:pPr>
             <w:r>
-              <w:rPr>
-                <w:color w:val="212121"/>
-                <w:sz w:val="18"/>
-              </w:rPr>
               <w:t>Led cloud governance initiatives including Azure Policy, tagging compliance, RBAC, and security baseline enforcement</w:t>
             </w:r>
           </w:p>
@@ -1040,10 +1119,6 @@
               <w:ind w:left="288"/>
             </w:pPr>
             <w:r>
-              <w:rPr>
-                <w:color w:val="212121"/>
-                <w:sz w:val="18"/>
-              </w:rPr>
               <w:t>Coordinated platform monitoring and alerting using Azure Monitor, Log Analytics, and Defender for Cloud</w:t>
             </w:r>
           </w:p>
@@ -1054,10 +1129,6 @@
               <w:ind w:left="288"/>
             </w:pPr>
             <w:r>
-              <w:rPr>
-                <w:color w:val="212121"/>
-                <w:sz w:val="18"/>
-              </w:rPr>
               <w:t>Drove capacity planning, resource optimisation, and monthly FinOps reviews with customer stakeholders</w:t>
             </w:r>
           </w:p>
@@ -1068,10 +1139,6 @@
               <w:ind w:left="288"/>
             </w:pPr>
             <w:r>
-              <w:rPr>
-                <w:color w:val="212121"/>
-                <w:sz w:val="18"/>
-              </w:rPr>
               <w:t>Managed change, incident, and problem management aligned to ITIL practices and customer SLA commitments</w:t>
             </w:r>
           </w:p>
@@ -1082,10 +1149,6 @@
               <w:ind w:left="288"/>
             </w:pPr>
             <w:r>
-              <w:rPr>
-                <w:color w:val="212121"/>
-                <w:sz w:val="18"/>
-              </w:rPr>
               <w:t>Mentored junior engineers on Azure best practices and delivered internal knowledge-sharing sessions</w:t>
             </w:r>
           </w:p>
@@ -1127,10 +1190,6 @@
               <w:ind w:left="288"/>
             </w:pPr>
             <w:r>
-              <w:rPr>
-                <w:color w:val="212121"/>
-                <w:sz w:val="18"/>
-              </w:rPr>
               <w:t>Managed cloud delivery for multiple Azure migration programs across planning, design, execution, and transition phases</w:t>
             </w:r>
           </w:p>
@@ -1141,10 +1200,6 @@
               <w:ind w:left="288"/>
             </w:pPr>
             <w:r>
-              <w:rPr>
-                <w:color w:val="212121"/>
-                <w:sz w:val="18"/>
-              </w:rPr>
               <w:t>Led provisioning of VMs, storage, NSG, Key Vault, and CI/CD pipelines for enterprise clients</w:t>
             </w:r>
           </w:p>
@@ -1155,10 +1210,6 @@
               <w:ind w:left="288"/>
             </w:pPr>
             <w:r>
-              <w:rPr>
-                <w:color w:val="212121"/>
-                <w:sz w:val="18"/>
-              </w:rPr>
               <w:t>Directed enterprise integration for secure file-transfer and messaging systems (Connect:Direct, IBM MQ)</w:t>
             </w:r>
           </w:p>
@@ -1169,10 +1220,6 @@
               <w:ind w:left="288"/>
             </w:pPr>
             <w:r>
-              <w:rPr>
-                <w:color w:val="212121"/>
-                <w:sz w:val="18"/>
-              </w:rPr>
               <w:t>Facilitated migration acceptance testing (MAT), knowledge transfer, and post-go-live hypercare support</w:t>
             </w:r>
           </w:p>
@@ -1214,10 +1261,6 @@
               <w:ind w:left="288"/>
             </w:pPr>
             <w:r>
-              <w:rPr>
-                <w:color w:val="212121"/>
-                <w:sz w:val="18"/>
-              </w:rPr>
               <w:t>Delivered L1/L2 production support for AT&amp;T telecom cloud infrastructure with SLA adherence</w:t>
             </w:r>
           </w:p>
@@ -1228,10 +1271,6 @@
               <w:ind w:left="288"/>
             </w:pPr>
             <w:r>
-              <w:rPr>
-                <w:color w:val="212121"/>
-                <w:sz w:val="18"/>
-              </w:rPr>
               <w:t>Conducted root cause analysis for high-severity defects to reduce recurrence and improve stability</w:t>
             </w:r>
           </w:p>
@@ -1242,10 +1281,6 @@
               <w:ind w:left="288"/>
             </w:pPr>
             <w:r>
-              <w:rPr>
-                <w:color w:val="212121"/>
-                <w:sz w:val="18"/>
-              </w:rPr>
               <w:t>Supported infrastructure reliability, monitoring, and automation for cloud operations</w:t>
             </w:r>
           </w:p>
@@ -1274,6 +1309,10 @@
               <w:pStyle w:val="ListBullet"/>
               <w:spacing w:after="40" w:line="269" w:lineRule="auto"/>
               <w:ind w:left="288"/>
+              <w:rPr>
+                <w:color w:val="212121"/>
+                <w:sz w:val="18"/>
+              </w:rPr>
             </w:pPr>
             <w:r>
               <w:rPr>
@@ -1288,6 +1327,10 @@
               <w:pStyle w:val="ListBullet"/>
               <w:spacing w:after="40" w:line="269" w:lineRule="auto"/>
               <w:ind w:left="288"/>
+              <w:rPr>
+                <w:color w:val="212121"/>
+                <w:sz w:val="18"/>
+              </w:rPr>
             </w:pPr>
             <w:r>
               <w:rPr>
@@ -1302,13 +1345,17 @@
               <w:pStyle w:val="ListBullet"/>
               <w:spacing w:after="40" w:line="269" w:lineRule="auto"/>
               <w:ind w:left="288"/>
+              <w:rPr>
+                <w:color w:val="212121"/>
+                <w:sz w:val="18"/>
+              </w:rPr>
             </w:pPr>
             <w:r>
               <w:rPr>
                 <w:color w:val="212121"/>
                 <w:sz w:val="18"/>
               </w:rPr>
-              <w:t>Built leadership dashboards for cloud resource health, performance metrics, and operational decision-making</w:t>
+              <w:t>Optimized VM sizing and scheduling across Azure and AWS environments, delivering ~30% cloud cost savings while maintaining performance and SLA targets.</w:t>
             </w:r>
           </w:p>
           <w:p>
@@ -1316,21 +1363,17 @@
               <w:pStyle w:val="ListBullet"/>
               <w:spacing w:after="40" w:line="269" w:lineRule="auto"/>
               <w:ind w:left="288"/>
+              <w:rPr>
+                <w:color w:val="212121"/>
+                <w:sz w:val="18"/>
+              </w:rPr>
             </w:pPr>
             <w:r>
               <w:rPr>
                 <w:color w:val="212121"/>
                 <w:sz w:val="18"/>
               </w:rPr>
-              <w:t xml:space="preserve">Strengthened delivery governance across operations and engineering, improving team </w:t>
-            </w:r>
-            <w:r>
-              <w:rPr>
-                <w:color w:val="212121"/>
-                <w:sz w:val="18"/>
-              </w:rPr>
-              <w:lastRenderedPageBreak/>
-              <w:t>output and audit scores</w:t>
+              <w:t>Strengthened delivery governance across operations and engineering, improving team output and audit scores</w:t>
             </w:r>
           </w:p>
           <w:p>
@@ -1338,6 +1381,10 @@
               <w:pStyle w:val="ListBullet"/>
               <w:spacing w:after="40" w:line="269" w:lineRule="auto"/>
               <w:ind w:left="288"/>
+              <w:rPr>
+                <w:color w:val="212121"/>
+                <w:sz w:val="18"/>
+              </w:rPr>
             </w:pPr>
             <w:r>
               <w:rPr>

</xml_diff>